<commit_message>
Jasmine Fontus Assignment 9.docx
</commit_message>
<xml_diff>
--- a/module-9/module-9/Jasmine Fontus Assignment 9.docx
+++ b/module-9/module-9/Jasmine Fontus Assignment 9.docx
@@ -2,24 +2,55 @@
 <file path=word/document.xml><?xml version="1.0" encoding="utf-8"?>
 <w:document xmlns:wpc="http://schemas.microsoft.com/office/word/2010/wordprocessingCanvas" xmlns:mc="http://schemas.openxmlformats.org/markup-compatibility/2006" xmlns:o="urn:schemas-microsoft-com:office:office" xmlns:r="http://schemas.openxmlformats.org/officeDocument/2006/relationships" xmlns:m="http://schemas.openxmlformats.org/officeDocument/2006/math" xmlns:v="urn:schemas-microsoft-com:vml" xmlns:wp14="http://schemas.microsoft.com/office/word/2010/wordprocessingDrawing" xmlns:wp="http://schemas.openxmlformats.org/drawingml/2006/wordprocessingDrawing" xmlns:w10="urn:schemas-microsoft-com:office:word" xmlns:w="http://schemas.openxmlformats.org/wordprocessingml/2006/main" xmlns:w14="http://schemas.microsoft.com/office/word/2010/wordml" xmlns:w15="http://schemas.microsoft.com/office/word/2012/wordml" xmlns:wpg="http://schemas.microsoft.com/office/word/2010/wordprocessingGroup" xmlns:wpi="http://schemas.microsoft.com/office/word/2010/wordprocessingInk" xmlns:wne="http://schemas.microsoft.com/office/word/2006/wordml" xmlns:wps="http://schemas.microsoft.com/office/word/2010/wordprocessingShape" xmlns:w16se="http://schemas.microsoft.com/office/word/2015/wordml/symex" xmlns:w16cid="http://schemas.microsoft.com/office/word/2016/wordml/cid" xmlns:w16="http://schemas.microsoft.com/office/word/2018/wordml" xmlns:w16cex="http://schemas.microsoft.com/office/word/2018/wordml/cex" xmlns:w16sdtdh="http://schemas.microsoft.com/office/word/2020/wordml/sdtdatahash" xmlns:w16sdtfl="http://schemas.microsoft.com/office/word/2024/wordml/sdtformatlock" xmlns:a="http://schemas.openxmlformats.org/drawingml/2006/main" xmlns:pic="http://schemas.openxmlformats.org/drawingml/2006/picture" xmlns:a14="http://schemas.microsoft.com/office/drawing/2010/main" mc:Ignorable="w14 w15 wp14 w16se w16cid w16 w16cex w16sdtdh w16sdtfl">
   <w:body>
-    <w:p xmlns:wp14="http://schemas.microsoft.com/office/word/2010/wordml" wp14:paraId="2C078E63" wp14:textId="77BB445F">
+    <w:p xmlns:wp14="http://schemas.microsoft.com/office/word/2010/wordml" wp14:paraId="2C078E63" wp14:textId="55A286FD">
       <w:r>
-        <w:rPr/>
-        <w:t>Jasmine</w:t>
-      </w:r>
-      <w:r>
-        <w:rPr/>
-        <w:t xml:space="preserve"> Fontus</w:t>
-      </w:r>
-      <w:r>
-        <w:rPr/>
-        <w:t xml:space="preserve"> Assignment 9.2</w:t>
+        <w:drawing>
+          <wp:inline xmlns:wp14="http://schemas.microsoft.com/office/word/2010/wordprocessingDrawing" wp14:editId="409C9DE1" wp14:anchorId="5DEA4740">
+            <wp:extent cx="5943600" cy="4524375"/>
+            <wp:effectExtent l="0" t="0" r="0" b="0"/>
+            <wp:docPr id="1721391305" name="drawing"/>
+            <wp:cNvGraphicFramePr>
+              <a:graphicFrameLocks noChangeAspect="1"/>
+            </wp:cNvGraphicFramePr>
+            <a:graphic>
+              <a:graphicData xmlns:a="http://schemas.openxmlformats.org/drawingml/2006/main" uri="http://schemas.openxmlformats.org/drawingml/2006/picture">
+                <pic:pic xmlns:pic="http://schemas.openxmlformats.org/drawingml/2006/picture">
+                  <pic:nvPicPr>
+                    <pic:cNvPr id="1721391305" name="Picture 1721391305"/>
+                    <pic:cNvPicPr/>
+                  </pic:nvPicPr>
+                  <pic:blipFill>
+                    <a:blip xmlns:r="http://schemas.openxmlformats.org/officeDocument/2006/relationships" r:embed="rId1351255709">
+                      <a:extLst>
+                        <a:ext uri="{28A0092B-C50C-407E-A947-70E740481C1C}">
+                          <a14:useLocalDpi xmlns:a14="http://schemas.microsoft.com/office/drawing/2010/main"/>
+                        </a:ext>
+                      </a:extLst>
+                    </a:blip>
+                    <a:stretch>
+                      <a:fillRect/>
+                    </a:stretch>
+                  </pic:blipFill>
+                  <pic:spPr>
+                    <a:xfrm>
+                      <a:off x="0" y="0"/>
+                      <a:ext cx="5943600" cy="4524375"/>
+                    </a:xfrm>
+                    <a:prstGeom prst="rect">
+                      <a:avLst/>
+                    </a:prstGeom>
+                  </pic:spPr>
+                </pic:pic>
+              </a:graphicData>
+            </a:graphic>
+          </wp:inline>
+        </w:drawing>
       </w:r>
     </w:p>
     <w:p>
       <w:r>
         <w:drawing>
-          <wp:inline wp14:editId="6C168BCD" wp14:anchorId="4D82F11E">
+          <wp:inline wp14:editId="2137762D" wp14:anchorId="4D82F11E">
             <wp:extent cx="5943600" cy="3409950"/>
             <wp:effectExtent l="0" t="0" r="0" b="0"/>
             <wp:docPr id="953931540" name="drawing"/>
@@ -62,7 +93,7 @@
       </w:r>
       <w:r>
         <w:drawing>
-          <wp:inline wp14:editId="368325D0" wp14:anchorId="349CB7AB">
+          <wp:inline wp14:editId="7BB30E5B" wp14:anchorId="349CB7AB">
             <wp:extent cx="5943600" cy="2171700"/>
             <wp:effectExtent l="0" t="0" r="0" b="0"/>
             <wp:docPr id="2015327145" name="drawing"/>

</xml_diff>